<commit_message>
Test pack 09: Word script prereq 0.3 -> double-click the in-folder SFTP launcher
Regenerated Code_Flows_Test_Script.docx (was write-locked by Word until now):
prerequisite 0.3 now says 'Double-click Start_SFTP_Server.bat in this folder'
instead of the manual testftp/run_all.py command line, matching the README and
the committed launcher bats. XSD-validated (All validations PASSED); verified
the old run_all.py wording is gone from the doc.

Co-Authored-By: Claude Opus 4.8 <noreply@anthropic.com>
</commit_message>
<xml_diff>
--- a/test_human/09_Code_Flows/Code_Flows_Test_Script.docx
+++ b/test_human/09_Code_Flows/Code_Flows_Test_Script.docx
@@ -346,7 +346,7 @@
                 <w:sz w:val="20"/>
                 <w:szCs w:val="20"/>
               </w:rPr>
-              <w:t xml:space="preserve">0.3  Start the SFTP test server (leave running)</w:t>
+              <w:t xml:space="preserve">0.3  Start the SFTP test server (leave its window open)</w:t>
             </w:r>
           </w:p>
         </w:tc>
@@ -371,7 +371,7 @@
                 <w:sz w:val="20"/>
                 <w:szCs w:val="20"/>
               </w:rPr>
-              <w:t xml:space="preserve">cd test_human\_sftp_test_server  then  &amp; C:\Users\james\miniconda3\envs\testftp\python.exe run_all.py</w:t>
+              <w:t xml:space="preserve">Double-click Start_SFTP_Server.bat in this folder (test_human\09_Code_Flows). Does nothing if already running; close the window or Ctrl+C to stop.</w:t>
             </w:r>
           </w:p>
         </w:tc>

</xml_diff>